<commit_message>
Embed documentation screenshots into Task 2 Word report document
</commit_message>
<xml_diff>
--- a/Portfolio WP2/2_Unjuk_Kerja Menulis Kode Dengan Prinsip Sesuai Guidelines dan Best Practice - Nugraha Jody.docx
+++ b/Portfolio WP2/2_Unjuk_Kerja Menulis Kode Dengan Prinsip Sesuai Guidelines dan Best Practice - Nugraha Jody.docx
@@ -29,7 +29,7 @@
           <w:color w:val="64748B"/>
           <w:sz w:val="22"/>
         </w:rPr>
-        <w:t>Menulis Kode Dengan Prinsip Sesuai Guidelines dan Best Practice</w:t>
+        <w:t>Mengimplementasikan Pemrograman Terstruktur</w:t>
         <w:br/>
         <w:t>Kode Unit: J.620100.017.02</w:t>
       </w:r>
@@ -158,13 +158,38 @@
         <w:jc w:val="center"/>
       </w:pPr>
       <w:r>
-        <w:rPr>
-          <w:rFonts w:ascii="Arial" w:hAnsi="Arial"/>
-          <w:b/>
-          <w:color w:val="EF4444"/>
-          <w:sz w:val="22"/>
-        </w:rPr>
-        <w:t>[ TEMPEL SCREENSHOT: TEMPEL SCREENSHOT BROWSER SAAT MEMBUKA HALAMAN DOKUMENTASI LARAVEL 10.X DI SINI ]</w:t>
+        <w:drawing>
+          <wp:inline xmlns:a="http://schemas.openxmlformats.org/drawingml/2006/main" xmlns:pic="http://schemas.openxmlformats.org/drawingml/2006/picture">
+            <wp:extent cx="4754880" cy="2530673"/>
+            <wp:docPr id="1" name="Picture 1"/>
+            <wp:cNvGraphicFramePr>
+              <a:graphicFrameLocks noChangeAspect="1"/>
+            </wp:cNvGraphicFramePr>
+            <a:graphic>
+              <a:graphicData uri="http://schemas.openxmlformats.org/drawingml/2006/picture">
+                <pic:pic>
+                  <pic:nvPicPr>
+                    <pic:cNvPr id="0" name="media__1783243275664.png"/>
+                    <pic:cNvPicPr/>
+                  </pic:nvPicPr>
+                  <pic:blipFill>
+                    <a:blip r:embed="rId9"/>
+                    <a:stretch>
+                      <a:fillRect/>
+                    </a:stretch>
+                  </pic:blipFill>
+                  <pic:spPr>
+                    <a:xfrm>
+                      <a:off x="0" y="0"/>
+                      <a:ext cx="4754880" cy="2530673"/>
+                    </a:xfrm>
+                    <a:prstGeom prst="rect"/>
+                  </pic:spPr>
+                </pic:pic>
+              </a:graphicData>
+            </a:graphic>
+          </wp:inline>
+        </w:drawing>
       </w:r>
     </w:p>
     <w:p>
@@ -176,10 +201,10 @@
         <w:rPr>
           <w:rFonts w:ascii="Arial" w:hAnsi="Arial"/>
           <w:i/>
-          <w:color w:val="94A3B8"/>
+          <w:color w:val="64748B"/>
           <w:sz w:val="18"/>
         </w:rPr>
-        <w:t>(Silakan ambil screenshot dari kodingan atau browser lokal, lalu tempel di atas)</w:t>
+        <w:t>(Screenshot Output Program untuk Membuka Dokumentasi Resmi Laravel)</w:t>
       </w:r>
     </w:p>
     <w:p>
@@ -275,13 +300,38 @@
         <w:jc w:val="center"/>
       </w:pPr>
       <w:r>
-        <w:rPr>
-          <w:rFonts w:ascii="Arial" w:hAnsi="Arial"/>
-          <w:b/>
-          <w:color w:val="EF4444"/>
-          <w:sz w:val="22"/>
-        </w:rPr>
-        <w:t>[ TEMPEL SCREENSHOT: TEMPEL SCREENSHOT TERMINAL CMD/POWERSHELL SAAT MENJALANKAN PERINTAH COMPOSER -V DI SINI ]</w:t>
+        <w:drawing>
+          <wp:inline xmlns:a="http://schemas.openxmlformats.org/drawingml/2006/main" xmlns:pic="http://schemas.openxmlformats.org/drawingml/2006/picture">
+            <wp:extent cx="4754880" cy="2530673"/>
+            <wp:docPr id="2" name="Picture 2"/>
+            <wp:cNvGraphicFramePr>
+              <a:graphicFrameLocks noChangeAspect="1"/>
+            </wp:cNvGraphicFramePr>
+            <a:graphic>
+              <a:graphicData uri="http://schemas.openxmlformats.org/drawingml/2006/picture">
+                <pic:pic>
+                  <pic:nvPicPr>
+                    <pic:cNvPr id="0" name="media__1783243310723.png"/>
+                    <pic:cNvPicPr/>
+                  </pic:nvPicPr>
+                  <pic:blipFill>
+                    <a:blip r:embed="rId10"/>
+                    <a:stretch>
+                      <a:fillRect/>
+                    </a:stretch>
+                  </pic:blipFill>
+                  <pic:spPr>
+                    <a:xfrm>
+                      <a:off x="0" y="0"/>
+                      <a:ext cx="4754880" cy="2530673"/>
+                    </a:xfrm>
+                    <a:prstGeom prst="rect"/>
+                  </pic:spPr>
+                </pic:pic>
+              </a:graphicData>
+            </a:graphic>
+          </wp:inline>
+        </w:drawing>
       </w:r>
     </w:p>
     <w:p>
@@ -293,10 +343,10 @@
         <w:rPr>
           <w:rFonts w:ascii="Arial" w:hAnsi="Arial"/>
           <w:i/>
-          <w:color w:val="94A3B8"/>
+          <w:color w:val="64748B"/>
           <w:sz w:val="18"/>
         </w:rPr>
-        <w:t>(Silakan ambil screenshot dari kodingan atau browser lokal, lalu tempel di atas)</w:t>
+        <w:t>(Screenshot Output Program untuk Mengecek Versi Composer)</w:t>
       </w:r>
     </w:p>
     <w:p>

</xml_diff>

<commit_message>
Embed localhost home and booking screenshots into Task 2 Word report document
</commit_message>
<xml_diff>
--- a/Portfolio WP2/2_Unjuk_Kerja Menulis Kode Dengan Prinsip Sesuai Guidelines dan Best Practice - Nugraha Jody.docx
+++ b/Portfolio WP2/2_Unjuk_Kerja Menulis Kode Dengan Prinsip Sesuai Guidelines dan Best Practice - Nugraha Jody.docx
@@ -97,7 +97,7 @@
           <w:rFonts w:ascii="Arial" w:hAnsi="Arial"/>
           <w:sz w:val="21"/>
         </w:rPr>
-        <w:t>Langkah pertama adalah membuka dokumentasi resmi Laravel di https://laravel.com/docs dan memilih versi Laravel yang sesuai dengan projek (Laravel 10.x).</w:t>
+        <w:t>Langkah pertama adalah membuka dokumentasi resmi Laravel di https://laravel.com/docs/10.x/installation.</w:t>
       </w:r>
     </w:p>
     <w:tbl>
@@ -227,7 +227,149 @@
           <w:color w:val="0F172A"/>
           <w:sz w:val="25"/>
         </w:rPr>
-        <w:t>Langkah 2: Mengecek Versi Composer</w:t>
+        <w:t>Langkah 2: Memeriksa Cara Instalasi Projek</w:t>
+      </w:r>
+    </w:p>
+    <w:p>
+      <w:pPr>
+        <w:spacing w:after="120"/>
+      </w:pPr>
+      <w:r>
+        <w:rPr>
+          <w:rFonts w:ascii="Arial" w:hAnsi="Arial"/>
+          <w:sz w:val="21"/>
+        </w:rPr>
+        <w:t>Scroll halaman dokumentasi ke bawah hingga bagian 'Creating a Laravel Project' untuk melihat instruksi instalasi standar.</w:t>
+      </w:r>
+    </w:p>
+    <w:tbl>
+      <w:tblPr>
+        <w:tblW w:type="auto" w:w="0"/>
+        <w:tblLayout w:type="fixed"/>
+        <w:tblLook w:firstColumn="1" w:firstRow="1" w:lastColumn="0" w:lastRow="0" w:noHBand="0" w:noVBand="1" w:val="04A0"/>
+      </w:tblPr>
+      <w:tblGrid>
+        <w:gridCol w:w="8640"/>
+      </w:tblGrid>
+      <w:tr>
+        <w:tc>
+          <w:tcPr>
+            <w:tcW w:type="dxa" w:w="8640"/>
+            <w:shd w:val="clear" w:color="auto" w:fill="F2F2F2"/>
+          </w:tcPr>
+          <w:p>
+            <w:pPr>
+              <w:spacing w:before="80" w:after="80"/>
+              <w:ind w:left="120"/>
+            </w:pPr>
+            <w:r>
+              <w:rPr>
+                <w:rFonts w:ascii="Consolas" w:hAnsi="Consolas"/>
+                <w:color w:val="1E1E1E"/>
+                <w:sz w:val="19"/>
+              </w:rPr>
+              <w:t>composer create-project laravel/laravel example-app</w:t>
+            </w:r>
+          </w:p>
+        </w:tc>
+      </w:tr>
+    </w:tbl>
+    <w:p>
+      <w:pPr>
+        <w:spacing w:before="120" w:after="240"/>
+      </w:pPr>
+      <w:r>
+        <w:rPr>
+          <w:rFonts w:ascii="Arial" w:hAnsi="Arial"/>
+          <w:b/>
+          <w:sz w:val="20"/>
+        </w:rPr>
+        <w:t xml:space="preserve">Penjelasan: </w:t>
+      </w:r>
+      <w:r>
+        <w:rPr>
+          <w:rFonts w:ascii="Arial" w:hAnsi="Arial"/>
+          <w:sz w:val="20"/>
+        </w:rPr>
+        <w:t>Memeriksa template command composer resmi dari pembuat framework Laravel untuk proses instalasi yang sesuai best practice.</w:t>
+      </w:r>
+    </w:p>
+    <w:p>
+      <w:pPr>
+        <w:spacing w:before="160" w:after="360"/>
+        <w:jc w:val="center"/>
+      </w:pPr>
+      <w:r>
+        <w:drawing>
+          <wp:inline xmlns:a="http://schemas.openxmlformats.org/drawingml/2006/main" xmlns:pic="http://schemas.openxmlformats.org/drawingml/2006/picture">
+            <wp:extent cx="4754880" cy="2530673"/>
+            <wp:docPr id="2" name="Picture 2"/>
+            <wp:cNvGraphicFramePr>
+              <a:graphicFrameLocks noChangeAspect="1"/>
+            </wp:cNvGraphicFramePr>
+            <a:graphic>
+              <a:graphicData uri="http://schemas.openxmlformats.org/drawingml/2006/picture">
+                <pic:pic>
+                  <pic:nvPicPr>
+                    <pic:cNvPr id="0" name="media__1783243310723.png"/>
+                    <pic:cNvPicPr/>
+                  </pic:nvPicPr>
+                  <pic:blipFill>
+                    <a:blip r:embed="rId10"/>
+                    <a:stretch>
+                      <a:fillRect/>
+                    </a:stretch>
+                  </pic:blipFill>
+                  <pic:spPr>
+                    <a:xfrm>
+                      <a:off x="0" y="0"/>
+                      <a:ext cx="4754880" cy="2530673"/>
+                    </a:xfrm>
+                    <a:prstGeom prst="rect"/>
+                  </pic:spPr>
+                </pic:pic>
+              </a:graphicData>
+            </a:graphic>
+          </wp:inline>
+        </w:drawing>
+      </w:r>
+    </w:p>
+    <w:p>
+      <w:pPr>
+        <w:spacing w:after="360"/>
+        <w:jc w:val="center"/>
+      </w:pPr>
+      <w:r>
+        <w:rPr>
+          <w:rFonts w:ascii="Arial" w:hAnsi="Arial"/>
+          <w:i/>
+          <w:color w:val="64748B"/>
+          <w:sz w:val="18"/>
+        </w:rPr>
+        <w:t>(Screenshot Output Program untuk Memeriksa Cara Instalasi Projek)</w:t>
+      </w:r>
+    </w:p>
+    <w:p>
+      <w:pPr>
+        <w:jc w:val="center"/>
+      </w:pPr>
+      <w:r>
+        <w:t>------------------------------------------------------------</w:t>
+      </w:r>
+    </w:p>
+    <w:p>
+      <w:pPr>
+        <w:keepNext/>
+        <w:spacing w:before="280" w:after="80"/>
+      </w:pPr>
+      <w:r>
+        <w:rPr>
+          <w:rFonts w:ascii="Arial" w:hAnsi="Arial"/>
+          <w:b/>
+          <w:color w:val="0F172A"/>
+          <w:sz w:val="25"/>
+        </w:rPr>
+        <w:t>Langkah 3: Mengecek Versi Composer</w:t>
       </w:r>
     </w:p>
     <w:p>
@@ -300,38 +442,13 @@
         <w:jc w:val="center"/>
       </w:pPr>
       <w:r>
-        <w:drawing>
-          <wp:inline xmlns:a="http://schemas.openxmlformats.org/drawingml/2006/main" xmlns:pic="http://schemas.openxmlformats.org/drawingml/2006/picture">
-            <wp:extent cx="4754880" cy="2530673"/>
-            <wp:docPr id="2" name="Picture 2"/>
-            <wp:cNvGraphicFramePr>
-              <a:graphicFrameLocks noChangeAspect="1"/>
-            </wp:cNvGraphicFramePr>
-            <a:graphic>
-              <a:graphicData uri="http://schemas.openxmlformats.org/drawingml/2006/picture">
-                <pic:pic>
-                  <pic:nvPicPr>
-                    <pic:cNvPr id="0" name="media__1783243310723.png"/>
-                    <pic:cNvPicPr/>
-                  </pic:nvPicPr>
-                  <pic:blipFill>
-                    <a:blip r:embed="rId10"/>
-                    <a:stretch>
-                      <a:fillRect/>
-                    </a:stretch>
-                  </pic:blipFill>
-                  <pic:spPr>
-                    <a:xfrm>
-                      <a:off x="0" y="0"/>
-                      <a:ext cx="4754880" cy="2530673"/>
-                    </a:xfrm>
-                    <a:prstGeom prst="rect"/>
-                  </pic:spPr>
-                </pic:pic>
-              </a:graphicData>
-            </a:graphic>
-          </wp:inline>
-        </w:drawing>
+        <w:rPr>
+          <w:rFonts w:ascii="Arial" w:hAnsi="Arial"/>
+          <w:b/>
+          <w:color w:val="EF4444"/>
+          <w:sz w:val="22"/>
+        </w:rPr>
+        <w:t>[ TEMPEL SCREENSHOT: TEMPEL SCREENSHOT TERMINAL CMD/POWERSHELL SAAT MENJALANKAN PERINTAH COMPOSER -V DI SINI ]</w:t>
       </w:r>
     </w:p>
     <w:p>
@@ -343,10 +460,10 @@
         <w:rPr>
           <w:rFonts w:ascii="Arial" w:hAnsi="Arial"/>
           <w:i/>
-          <w:color w:val="64748B"/>
+          <w:color w:val="94A3B8"/>
           <w:sz w:val="18"/>
         </w:rPr>
-        <w:t>(Screenshot Output Program untuk Mengecek Versi Composer)</w:t>
+        <w:t>(Silakan ambil screenshot dari kodingan atau browser lokal, lalu tempel di atas)</w:t>
       </w:r>
     </w:p>
     <w:p>
@@ -369,7 +486,7 @@
           <w:color w:val="0F172A"/>
           <w:sz w:val="25"/>
         </w:rPr>
-        <w:t>Langkah 3: Mengecek Versi PHP</w:t>
+        <w:t>Langkah 4: Mengecek Versi PHP</w:t>
       </w:r>
     </w:p>
     <w:p>
@@ -449,123 +566,6 @@
           <w:sz w:val="22"/>
         </w:rPr>
         <w:t>[ TEMPEL SCREENSHOT: TEMPEL SCREENSHOT TERMINAL SAAT MENJALANKAN PERINTAH PHP -V DI SINI ]</w:t>
-      </w:r>
-    </w:p>
-    <w:p>
-      <w:pPr>
-        <w:spacing w:after="360"/>
-        <w:jc w:val="center"/>
-      </w:pPr>
-      <w:r>
-        <w:rPr>
-          <w:rFonts w:ascii="Arial" w:hAnsi="Arial"/>
-          <w:i/>
-          <w:color w:val="94A3B8"/>
-          <w:sz w:val="18"/>
-        </w:rPr>
-        <w:t>(Silakan ambil screenshot dari kodingan atau browser lokal, lalu tempel di atas)</w:t>
-      </w:r>
-    </w:p>
-    <w:p>
-      <w:pPr>
-        <w:jc w:val="center"/>
-      </w:pPr>
-      <w:r>
-        <w:t>------------------------------------------------------------</w:t>
-      </w:r>
-    </w:p>
-    <w:p>
-      <w:pPr>
-        <w:keepNext/>
-        <w:spacing w:before="280" w:after="80"/>
-      </w:pPr>
-      <w:r>
-        <w:rPr>
-          <w:rFonts w:ascii="Arial" w:hAnsi="Arial"/>
-          <w:b/>
-          <w:color w:val="0F172A"/>
-          <w:sz w:val="25"/>
-        </w:rPr>
-        <w:t>Langkah 4: Membuat Projek Baru Laravel</w:t>
-      </w:r>
-    </w:p>
-    <w:p>
-      <w:pPr>
-        <w:spacing w:after="120"/>
-      </w:pPr>
-      <w:r>
-        <w:rPr>
-          <w:rFonts w:ascii="Arial" w:hAnsi="Arial"/>
-          <w:sz w:val="21"/>
-        </w:rPr>
-        <w:t>Membuat projek Laravel baru di folder C:\laravel10 dengan nama Bengkel-motor menggunakan perintah composer.</w:t>
-      </w:r>
-    </w:p>
-    <w:tbl>
-      <w:tblPr>
-        <w:tblW w:type="auto" w:w="0"/>
-        <w:tblLayout w:type="fixed"/>
-        <w:tblLook w:firstColumn="1" w:firstRow="1" w:lastColumn="0" w:lastRow="0" w:noHBand="0" w:noVBand="1" w:val="04A0"/>
-      </w:tblPr>
-      <w:tblGrid>
-        <w:gridCol w:w="8640"/>
-      </w:tblGrid>
-      <w:tr>
-        <w:tc>
-          <w:tcPr>
-            <w:tcW w:type="dxa" w:w="8640"/>
-            <w:shd w:val="clear" w:color="auto" w:fill="F2F2F2"/>
-          </w:tcPr>
-          <w:p>
-            <w:pPr>
-              <w:spacing w:before="80" w:after="80"/>
-              <w:ind w:left="120"/>
-            </w:pPr>
-            <w:r>
-              <w:rPr>
-                <w:rFonts w:ascii="Consolas" w:hAnsi="Consolas"/>
-                <w:color w:val="1E1E1E"/>
-                <w:sz w:val="19"/>
-              </w:rPr>
-              <w:t>composer create-project laravel/laravel Bengkel-motor "10.*"</w:t>
-            </w:r>
-          </w:p>
-        </w:tc>
-      </w:tr>
-    </w:tbl>
-    <w:p>
-      <w:pPr>
-        <w:spacing w:before="120" w:after="240"/>
-      </w:pPr>
-      <w:r>
-        <w:rPr>
-          <w:rFonts w:ascii="Arial" w:hAnsi="Arial"/>
-          <w:b/>
-          <w:sz w:val="20"/>
-        </w:rPr>
-        <w:t xml:space="preserve">Penjelasan: </w:t>
-      </w:r>
-      <w:r>
-        <w:rPr>
-          <w:rFonts w:ascii="Arial" w:hAnsi="Arial"/>
-          <w:sz w:val="20"/>
-        </w:rPr>
-        <w:t>Perintah ini akan mengunduh struktur folder default Laravel 10 yang mengikuti struktur MVC (Model-View-Controller) sebagai basis dari projek BengkelPro.</w:t>
-      </w:r>
-    </w:p>
-    <w:p>
-      <w:pPr>
-        <w:spacing w:before="160" w:after="360"/>
-        <w:jc w:val="center"/>
-      </w:pPr>
-      <w:r>
-        <w:rPr>
-          <w:rFonts w:ascii="Arial" w:hAnsi="Arial"/>
-          <w:b/>
-          <w:color w:val="EF4444"/>
-          <w:sz w:val="22"/>
-        </w:rPr>
-        <w:t>[ TEMPEL SCREENSHOT: TEMPEL SCREENSHOT PROSES INSTALL/PEMBUATAN PROJEK LARAVEL DI COMMAND PROMPT DI SINI ]</w:t>
       </w:r>
     </w:p>
     <w:p>
@@ -786,7 +786,7 @@
           <w:rFonts w:ascii="Arial" w:hAnsi="Arial"/>
           <w:sz w:val="20"/>
         </w:rPr>
-        <w:t>Tampilan halaman sambutan default Laravel menandakan instalasi framework telah sukses dan siap dimodifikasi.</w:t>
+        <w:t>Tampilan halaman sambutan default website BengkelPro menandakan instalasi framework telah sukses dan berjalan di port lokal.</w:t>
       </w:r>
     </w:p>
     <w:p>
@@ -795,13 +795,38 @@
         <w:jc w:val="center"/>
       </w:pPr>
       <w:r>
-        <w:rPr>
-          <w:rFonts w:ascii="Arial" w:hAnsi="Arial"/>
-          <w:b/>
-          <w:color w:val="EF4444"/>
-          <w:sz w:val="22"/>
-        </w:rPr>
-        <w:t>[ TEMPEL SCREENSHOT: TEMPEL SCREENSHOT BROWSER SAAT MEMBUKA HTTP://127.0.0.1:8000 (HALAMAN DEFAULT WELCOME LARAVEL) DI SINI ]</w:t>
+        <w:drawing>
+          <wp:inline xmlns:a="http://schemas.openxmlformats.org/drawingml/2006/main" xmlns:pic="http://schemas.openxmlformats.org/drawingml/2006/picture">
+            <wp:extent cx="4754880" cy="2535317"/>
+            <wp:docPr id="3" name="Picture 3"/>
+            <wp:cNvGraphicFramePr>
+              <a:graphicFrameLocks noChangeAspect="1"/>
+            </wp:cNvGraphicFramePr>
+            <a:graphic>
+              <a:graphicData uri="http://schemas.openxmlformats.org/drawingml/2006/picture">
+                <pic:pic>
+                  <pic:nvPicPr>
+                    <pic:cNvPr id="0" name="media__1783243496794.png"/>
+                    <pic:cNvPicPr/>
+                  </pic:nvPicPr>
+                  <pic:blipFill>
+                    <a:blip r:embed="rId11"/>
+                    <a:stretch>
+                      <a:fillRect/>
+                    </a:stretch>
+                  </pic:blipFill>
+                  <pic:spPr>
+                    <a:xfrm>
+                      <a:off x="0" y="0"/>
+                      <a:ext cx="4754880" cy="2535317"/>
+                    </a:xfrm>
+                    <a:prstGeom prst="rect"/>
+                  </pic:spPr>
+                </pic:pic>
+              </a:graphicData>
+            </a:graphic>
+          </wp:inline>
+        </w:drawing>
       </w:r>
     </w:p>
     <w:p>
@@ -813,10 +838,10 @@
         <w:rPr>
           <w:rFonts w:ascii="Arial" w:hAnsi="Arial"/>
           <w:i/>
-          <w:color w:val="94A3B8"/>
+          <w:color w:val="64748B"/>
           <w:sz w:val="18"/>
         </w:rPr>
-        <w:t>(Silakan ambil screenshot dari kodingan atau browser lokal, lalu tempel di atas)</w:t>
+        <w:t>(Screenshot Output Program untuk Mengakses Aplikasi di Browser)</w:t>
       </w:r>
     </w:p>
     <w:p>
@@ -2316,13 +2341,38 @@
         <w:jc w:val="center"/>
       </w:pPr>
       <w:r>
-        <w:rPr>
-          <w:rFonts w:ascii="Arial" w:hAnsi="Arial"/>
-          <w:b/>
-          <w:color w:val="EF4444"/>
-          <w:sz w:val="22"/>
-        </w:rPr>
-        <w:t>[ TEMPEL SCREENSHOT: TEMPEL SCREENSHOT FORM INPUT BOOKING PADA BROWSER SAAT DIAKSES DI SINI ]</w:t>
+        <w:drawing>
+          <wp:inline xmlns:a="http://schemas.openxmlformats.org/drawingml/2006/main" xmlns:pic="http://schemas.openxmlformats.org/drawingml/2006/picture">
+            <wp:extent cx="4754880" cy="2512100"/>
+            <wp:docPr id="4" name="Picture 4"/>
+            <wp:cNvGraphicFramePr>
+              <a:graphicFrameLocks noChangeAspect="1"/>
+            </wp:cNvGraphicFramePr>
+            <a:graphic>
+              <a:graphicData uri="http://schemas.openxmlformats.org/drawingml/2006/picture">
+                <pic:pic>
+                  <pic:nvPicPr>
+                    <pic:cNvPr id="0" name="media__1783243788277.png"/>
+                    <pic:cNvPicPr/>
+                  </pic:nvPicPr>
+                  <pic:blipFill>
+                    <a:blip r:embed="rId12"/>
+                    <a:stretch>
+                      <a:fillRect/>
+                    </a:stretch>
+                  </pic:blipFill>
+                  <pic:spPr>
+                    <a:xfrm>
+                      <a:off x="0" y="0"/>
+                      <a:ext cx="4754880" cy="2512100"/>
+                    </a:xfrm>
+                    <a:prstGeom prst="rect"/>
+                  </pic:spPr>
+                </pic:pic>
+              </a:graphicData>
+            </a:graphic>
+          </wp:inline>
+        </w:drawing>
       </w:r>
     </w:p>
     <w:p>
@@ -2334,10 +2384,10 @@
         <w:rPr>
           <w:rFonts w:ascii="Arial" w:hAnsi="Arial"/>
           <w:i/>
-          <w:color w:val="94A3B8"/>
+          <w:color w:val="64748B"/>
           <w:sz w:val="18"/>
         </w:rPr>
-        <w:t>(Silakan ambil screenshot dari kodingan atau browser lokal, lalu tempel di atas)</w:t>
+        <w:t>(Screenshot Output Program untuk Membuat View Form Booking (booking.blade.php))</w:t>
       </w:r>
     </w:p>
     <w:sectPr>

</xml_diff>

<commit_message>
Embed phpMyAdmin and env database configuration screenshots into Task 2 Word report document
</commit_message>
<xml_diff>
--- a/Portfolio WP2/2_Unjuk_Kerja Menulis Kode Dengan Prinsip Sesuai Guidelines dan Best Practice - Nugraha Jody.docx
+++ b/Portfolio WP2/2_Unjuk_Kerja Menulis Kode Dengan Prinsip Sesuai Guidelines dan Best Practice - Nugraha Jody.docx
@@ -937,13 +937,38 @@
         <w:jc w:val="center"/>
       </w:pPr>
       <w:r>
-        <w:rPr>
-          <w:rFonts w:ascii="Arial" w:hAnsi="Arial"/>
-          <w:b/>
-          <w:color w:val="EF4444"/>
-          <w:sz w:val="22"/>
-        </w:rPr>
-        <w:t>[ TEMPEL SCREENSHOT: TEMPEL SCREENSHOT PHPMYADMIN SAAT MEMBUAT DATABASE BENGKEL_MOTOR DI SINI ]</w:t>
+        <w:drawing>
+          <wp:inline xmlns:a="http://schemas.openxmlformats.org/drawingml/2006/main" xmlns:pic="http://schemas.openxmlformats.org/drawingml/2006/picture">
+            <wp:extent cx="4754880" cy="2526030"/>
+            <wp:docPr id="4" name="Picture 4"/>
+            <wp:cNvGraphicFramePr>
+              <a:graphicFrameLocks noChangeAspect="1"/>
+            </wp:cNvGraphicFramePr>
+            <a:graphic>
+              <a:graphicData uri="http://schemas.openxmlformats.org/drawingml/2006/picture">
+                <pic:pic>
+                  <pic:nvPicPr>
+                    <pic:cNvPr id="0" name="media__1783244003582.png"/>
+                    <pic:cNvPicPr/>
+                  </pic:nvPicPr>
+                  <pic:blipFill>
+                    <a:blip r:embed="rId12"/>
+                    <a:stretch>
+                      <a:fillRect/>
+                    </a:stretch>
+                  </pic:blipFill>
+                  <pic:spPr>
+                    <a:xfrm>
+                      <a:off x="0" y="0"/>
+                      <a:ext cx="4754880" cy="2526030"/>
+                    </a:xfrm>
+                    <a:prstGeom prst="rect"/>
+                  </pic:spPr>
+                </pic:pic>
+              </a:graphicData>
+            </a:graphic>
+          </wp:inline>
+        </w:drawing>
       </w:r>
     </w:p>
     <w:p>
@@ -955,10 +980,10 @@
         <w:rPr>
           <w:rFonts w:ascii="Arial" w:hAnsi="Arial"/>
           <w:i/>
-          <w:color w:val="94A3B8"/>
+          <w:color w:val="64748B"/>
           <w:sz w:val="18"/>
         </w:rPr>
-        <w:t>(Silakan ambil screenshot dari kodingan atau browser lokal, lalu tempel di atas)</w:t>
+        <w:t>(Screenshot Output Program untuk Membuat Database Baru di MySQL)</w:t>
       </w:r>
     </w:p>
     <w:p>
@@ -1064,13 +1089,38 @@
         <w:jc w:val="center"/>
       </w:pPr>
       <w:r>
-        <w:rPr>
-          <w:rFonts w:ascii="Arial" w:hAnsi="Arial"/>
-          <w:b/>
-          <w:color w:val="EF4444"/>
-          <w:sz w:val="22"/>
-        </w:rPr>
-        <w:t>[ TEMPEL SCREENSHOT: TEMPEL SCREENSHOT ISI FILE .ENV PADA BARIS KONFIGURASI DB_DATABASE DI SINI ]</w:t>
+        <w:drawing>
+          <wp:inline xmlns:a="http://schemas.openxmlformats.org/drawingml/2006/main" xmlns:pic="http://schemas.openxmlformats.org/drawingml/2006/picture">
+            <wp:extent cx="4754880" cy="2567821"/>
+            <wp:docPr id="5" name="Picture 5"/>
+            <wp:cNvGraphicFramePr>
+              <a:graphicFrameLocks noChangeAspect="1"/>
+            </wp:cNvGraphicFramePr>
+            <a:graphic>
+              <a:graphicData uri="http://schemas.openxmlformats.org/drawingml/2006/picture">
+                <pic:pic>
+                  <pic:nvPicPr>
+                    <pic:cNvPr id="0" name="media__1783244040474.png"/>
+                    <pic:cNvPicPr/>
+                  </pic:nvPicPr>
+                  <pic:blipFill>
+                    <a:blip r:embed="rId13"/>
+                    <a:stretch>
+                      <a:fillRect/>
+                    </a:stretch>
+                  </pic:blipFill>
+                  <pic:spPr>
+                    <a:xfrm>
+                      <a:off x="0" y="0"/>
+                      <a:ext cx="4754880" cy="2567821"/>
+                    </a:xfrm>
+                    <a:prstGeom prst="rect"/>
+                  </pic:spPr>
+                </pic:pic>
+              </a:graphicData>
+            </a:graphic>
+          </wp:inline>
+        </w:drawing>
       </w:r>
     </w:p>
     <w:p>
@@ -1082,10 +1132,10 @@
         <w:rPr>
           <w:rFonts w:ascii="Arial" w:hAnsi="Arial"/>
           <w:i/>
-          <w:color w:val="94A3B8"/>
+          <w:color w:val="64748B"/>
           <w:sz w:val="18"/>
         </w:rPr>
-        <w:t>(Silakan ambil screenshot dari kodingan atau browser lokal, lalu tempel di atas)</w:t>
+        <w:t>(Screenshot Output Program untuk Konfigurasi Environment Database (.env))</w:t>
       </w:r>
     </w:p>
     <w:p>
@@ -2344,7 +2394,7 @@
         <w:drawing>
           <wp:inline xmlns:a="http://schemas.openxmlformats.org/drawingml/2006/main" xmlns:pic="http://schemas.openxmlformats.org/drawingml/2006/picture">
             <wp:extent cx="4754880" cy="2512100"/>
-            <wp:docPr id="4" name="Picture 4"/>
+            <wp:docPr id="6" name="Picture 6"/>
             <wp:cNvGraphicFramePr>
               <a:graphicFrameLocks noChangeAspect="1"/>
             </wp:cNvGraphicFramePr>
@@ -2356,7 +2406,7 @@
                     <pic:cNvPicPr/>
                   </pic:nvPicPr>
                   <pic:blipFill>
-                    <a:blip r:embed="rId12"/>
+                    <a:blip r:embed="rId14"/>
                     <a:stretch>
                       <a:fillRect/>
                     </a:stretch>

</xml_diff>

<commit_message>
Embed Composer, PHP, artisan serve, and migration screenshots into Task 2 Word report document
</commit_message>
<xml_diff>
--- a/Portfolio WP2/2_Unjuk_Kerja Menulis Kode Dengan Prinsip Sesuai Guidelines dan Best Practice - Nugraha Jody.docx
+++ b/Portfolio WP2/2_Unjuk_Kerja Menulis Kode Dengan Prinsip Sesuai Guidelines dan Best Practice - Nugraha Jody.docx
@@ -113,7 +113,7 @@
         <w:tc>
           <w:tcPr>
             <w:tcW w:type="dxa" w:w="8640"/>
-            <w:shd w:val="clear" w:color="auto" w:fill="F2F2F2"/>
+            <w:shd w:fill="F2F2F2"/>
           </w:tcPr>
           <w:p>
             <w:pPr>
@@ -255,7 +255,7 @@
         <w:tc>
           <w:tcPr>
             <w:tcW w:type="dxa" w:w="8640"/>
-            <w:shd w:val="clear" w:color="auto" w:fill="F2F2F2"/>
+            <w:shd w:fill="F2F2F2"/>
           </w:tcPr>
           <w:p>
             <w:pPr>
@@ -397,7 +397,7 @@
         <w:tc>
           <w:tcPr>
             <w:tcW w:type="dxa" w:w="8640"/>
-            <w:shd w:val="clear" w:color="auto" w:fill="F2F2F2"/>
+            <w:shd w:fill="F2F2F2"/>
           </w:tcPr>
           <w:p>
             <w:pPr>
@@ -442,13 +442,38 @@
         <w:jc w:val="center"/>
       </w:pPr>
       <w:r>
-        <w:rPr>
-          <w:rFonts w:ascii="Arial" w:hAnsi="Arial"/>
-          <w:b/>
-          <w:color w:val="EF4444"/>
-          <w:sz w:val="22"/>
-        </w:rPr>
-        <w:t>[ TEMPEL SCREENSHOT: TEMPEL SCREENSHOT TERMINAL CMD/POWERSHELL SAAT MENJALANKAN PERINTAH COMPOSER -V DI SINI ]</w:t>
+        <w:drawing>
+          <wp:inline xmlns:a="http://schemas.openxmlformats.org/drawingml/2006/main" xmlns:pic="http://schemas.openxmlformats.org/drawingml/2006/picture">
+            <wp:extent cx="4754880" cy="2479596"/>
+            <wp:docPr id="3" name="Picture 3"/>
+            <wp:cNvGraphicFramePr>
+              <a:graphicFrameLocks noChangeAspect="1"/>
+            </wp:cNvGraphicFramePr>
+            <a:graphic>
+              <a:graphicData uri="http://schemas.openxmlformats.org/drawingml/2006/picture">
+                <pic:pic>
+                  <pic:nvPicPr>
+                    <pic:cNvPr id="0" name="media__1783244445355.png"/>
+                    <pic:cNvPicPr/>
+                  </pic:nvPicPr>
+                  <pic:blipFill>
+                    <a:blip r:embed="rId11"/>
+                    <a:stretch>
+                      <a:fillRect/>
+                    </a:stretch>
+                  </pic:blipFill>
+                  <pic:spPr>
+                    <a:xfrm>
+                      <a:off x="0" y="0"/>
+                      <a:ext cx="4754880" cy="2479596"/>
+                    </a:xfrm>
+                    <a:prstGeom prst="rect"/>
+                  </pic:spPr>
+                </pic:pic>
+              </a:graphicData>
+            </a:graphic>
+          </wp:inline>
+        </w:drawing>
       </w:r>
     </w:p>
     <w:p>
@@ -460,10 +485,10 @@
         <w:rPr>
           <w:rFonts w:ascii="Arial" w:hAnsi="Arial"/>
           <w:i/>
-          <w:color w:val="94A3B8"/>
+          <w:color w:val="64748B"/>
           <w:sz w:val="18"/>
         </w:rPr>
-        <w:t>(Silakan ambil screenshot dari kodingan atau browser lokal, lalu tempel di atas)</w:t>
+        <w:t>(Screenshot Output Program untuk Mengecek Versi Composer)</w:t>
       </w:r>
     </w:p>
     <w:p>
@@ -514,7 +539,7 @@
         <w:tc>
           <w:tcPr>
             <w:tcW w:type="dxa" w:w="8640"/>
-            <w:shd w:val="clear" w:color="auto" w:fill="F2F2F2"/>
+            <w:shd w:fill="F2F2F2"/>
           </w:tcPr>
           <w:p>
             <w:pPr>
@@ -559,13 +584,38 @@
         <w:jc w:val="center"/>
       </w:pPr>
       <w:r>
-        <w:rPr>
-          <w:rFonts w:ascii="Arial" w:hAnsi="Arial"/>
-          <w:b/>
-          <w:color w:val="EF4444"/>
-          <w:sz w:val="22"/>
-        </w:rPr>
-        <w:t>[ TEMPEL SCREENSHOT: TEMPEL SCREENSHOT TERMINAL SAAT MENJALANKAN PERINTAH PHP -V DI SINI ]</w:t>
+        <w:drawing>
+          <wp:inline xmlns:a="http://schemas.openxmlformats.org/drawingml/2006/main" xmlns:pic="http://schemas.openxmlformats.org/drawingml/2006/picture">
+            <wp:extent cx="4754880" cy="2437805"/>
+            <wp:docPr id="4" name="Picture 4"/>
+            <wp:cNvGraphicFramePr>
+              <a:graphicFrameLocks noChangeAspect="1"/>
+            </wp:cNvGraphicFramePr>
+            <a:graphic>
+              <a:graphicData uri="http://schemas.openxmlformats.org/drawingml/2006/picture">
+                <pic:pic>
+                  <pic:nvPicPr>
+                    <pic:cNvPr id="0" name="media__1783244468593.png"/>
+                    <pic:cNvPicPr/>
+                  </pic:nvPicPr>
+                  <pic:blipFill>
+                    <a:blip r:embed="rId12"/>
+                    <a:stretch>
+                      <a:fillRect/>
+                    </a:stretch>
+                  </pic:blipFill>
+                  <pic:spPr>
+                    <a:xfrm>
+                      <a:off x="0" y="0"/>
+                      <a:ext cx="4754880" cy="2437805"/>
+                    </a:xfrm>
+                    <a:prstGeom prst="rect"/>
+                  </pic:spPr>
+                </pic:pic>
+              </a:graphicData>
+            </a:graphic>
+          </wp:inline>
+        </w:drawing>
       </w:r>
     </w:p>
     <w:p>
@@ -577,10 +627,10 @@
         <w:rPr>
           <w:rFonts w:ascii="Arial" w:hAnsi="Arial"/>
           <w:i/>
-          <w:color w:val="94A3B8"/>
+          <w:color w:val="64748B"/>
           <w:sz w:val="18"/>
         </w:rPr>
-        <w:t>(Silakan ambil screenshot dari kodingan atau browser lokal, lalu tempel di atas)</w:t>
+        <w:t>(Screenshot Output Program untuk Mengecek Versi PHP)</w:t>
       </w:r>
     </w:p>
     <w:p>
@@ -631,7 +681,7 @@
         <w:tc>
           <w:tcPr>
             <w:tcW w:type="dxa" w:w="8640"/>
-            <w:shd w:val="clear" w:color="auto" w:fill="F2F2F2"/>
+            <w:shd w:fill="F2F2F2"/>
           </w:tcPr>
           <w:p>
             <w:pPr>
@@ -678,13 +728,38 @@
         <w:jc w:val="center"/>
       </w:pPr>
       <w:r>
-        <w:rPr>
-          <w:rFonts w:ascii="Arial" w:hAnsi="Arial"/>
-          <w:b/>
-          <w:color w:val="EF4444"/>
-          <w:sz w:val="22"/>
-        </w:rPr>
-        <w:t>[ TEMPEL SCREENSHOT: TEMPEL SCREENSHOT SAAT SERVER ARTISAN RUNNING DI TERMINAL DI SINI ]</w:t>
+        <w:drawing>
+          <wp:inline xmlns:a="http://schemas.openxmlformats.org/drawingml/2006/main" xmlns:pic="http://schemas.openxmlformats.org/drawingml/2006/picture">
+            <wp:extent cx="4754880" cy="2539960"/>
+            <wp:docPr id="5" name="Picture 5"/>
+            <wp:cNvGraphicFramePr>
+              <a:graphicFrameLocks noChangeAspect="1"/>
+            </wp:cNvGraphicFramePr>
+            <a:graphic>
+              <a:graphicData uri="http://schemas.openxmlformats.org/drawingml/2006/picture">
+                <pic:pic>
+                  <pic:nvPicPr>
+                    <pic:cNvPr id="0" name="media__1783244534084.png"/>
+                    <pic:cNvPicPr/>
+                  </pic:nvPicPr>
+                  <pic:blipFill>
+                    <a:blip r:embed="rId13"/>
+                    <a:stretch>
+                      <a:fillRect/>
+                    </a:stretch>
+                  </pic:blipFill>
+                  <pic:spPr>
+                    <a:xfrm>
+                      <a:off x="0" y="0"/>
+                      <a:ext cx="4754880" cy="2539960"/>
+                    </a:xfrm>
+                    <a:prstGeom prst="rect"/>
+                  </pic:spPr>
+                </pic:pic>
+              </a:graphicData>
+            </a:graphic>
+          </wp:inline>
+        </w:drawing>
       </w:r>
     </w:p>
     <w:p>
@@ -696,10 +771,10 @@
         <w:rPr>
           <w:rFonts w:ascii="Arial" w:hAnsi="Arial"/>
           <w:i/>
-          <w:color w:val="94A3B8"/>
+          <w:color w:val="64748B"/>
           <w:sz w:val="18"/>
         </w:rPr>
-        <w:t>(Silakan ambil screenshot dari kodingan atau browser lokal, lalu tempel di atas)</w:t>
+        <w:t>(Screenshot Output Program untuk Menjalankan Server Pengembangan Lokal)</w:t>
       </w:r>
     </w:p>
     <w:p>
@@ -750,7 +825,7 @@
         <w:tc>
           <w:tcPr>
             <w:tcW w:type="dxa" w:w="8640"/>
-            <w:shd w:val="clear" w:color="auto" w:fill="F2F2F2"/>
+            <w:shd w:fill="F2F2F2"/>
           </w:tcPr>
           <w:p>
             <w:pPr>
@@ -798,7 +873,7 @@
         <w:drawing>
           <wp:inline xmlns:a="http://schemas.openxmlformats.org/drawingml/2006/main" xmlns:pic="http://schemas.openxmlformats.org/drawingml/2006/picture">
             <wp:extent cx="4754880" cy="2535317"/>
-            <wp:docPr id="3" name="Picture 3"/>
+            <wp:docPr id="6" name="Picture 6"/>
             <wp:cNvGraphicFramePr>
               <a:graphicFrameLocks noChangeAspect="1"/>
             </wp:cNvGraphicFramePr>
@@ -810,7 +885,7 @@
                     <pic:cNvPicPr/>
                   </pic:nvPicPr>
                   <pic:blipFill>
-                    <a:blip r:embed="rId11"/>
+                    <a:blip r:embed="rId14"/>
                     <a:stretch>
                       <a:fillRect/>
                     </a:stretch>
@@ -892,7 +967,7 @@
         <w:tc>
           <w:tcPr>
             <w:tcW w:type="dxa" w:w="8640"/>
-            <w:shd w:val="clear" w:color="auto" w:fill="F2F2F2"/>
+            <w:shd w:fill="F2F2F2"/>
           </w:tcPr>
           <w:p>
             <w:pPr>
@@ -940,7 +1015,7 @@
         <w:drawing>
           <wp:inline xmlns:a="http://schemas.openxmlformats.org/drawingml/2006/main" xmlns:pic="http://schemas.openxmlformats.org/drawingml/2006/picture">
             <wp:extent cx="4754880" cy="2526030"/>
-            <wp:docPr id="4" name="Picture 4"/>
+            <wp:docPr id="7" name="Picture 7"/>
             <wp:cNvGraphicFramePr>
               <a:graphicFrameLocks noChangeAspect="1"/>
             </wp:cNvGraphicFramePr>
@@ -952,7 +1027,7 @@
                     <pic:cNvPicPr/>
                   </pic:nvPicPr>
                   <pic:blipFill>
-                    <a:blip r:embed="rId12"/>
+                    <a:blip r:embed="rId15"/>
                     <a:stretch>
                       <a:fillRect/>
                     </a:stretch>
@@ -1034,7 +1109,7 @@
         <w:tc>
           <w:tcPr>
             <w:tcW w:type="dxa" w:w="8640"/>
-            <w:shd w:val="clear" w:color="auto" w:fill="F2F2F2"/>
+            <w:shd w:fill="F2F2F2"/>
           </w:tcPr>
           <w:p>
             <w:pPr>
@@ -1092,7 +1167,7 @@
         <w:drawing>
           <wp:inline xmlns:a="http://schemas.openxmlformats.org/drawingml/2006/main" xmlns:pic="http://schemas.openxmlformats.org/drawingml/2006/picture">
             <wp:extent cx="4754880" cy="2567821"/>
-            <wp:docPr id="5" name="Picture 5"/>
+            <wp:docPr id="8" name="Picture 8"/>
             <wp:cNvGraphicFramePr>
               <a:graphicFrameLocks noChangeAspect="1"/>
             </wp:cNvGraphicFramePr>
@@ -1104,7 +1179,7 @@
                     <pic:cNvPicPr/>
                   </pic:nvPicPr>
                   <pic:blipFill>
-                    <a:blip r:embed="rId13"/>
+                    <a:blip r:embed="rId16"/>
                     <a:stretch>
                       <a:fillRect/>
                     </a:stretch>
@@ -1186,7 +1261,7 @@
         <w:tc>
           <w:tcPr>
             <w:tcW w:type="dxa" w:w="8640"/>
-            <w:shd w:val="clear" w:color="auto" w:fill="F2F2F2"/>
+            <w:shd w:fill="F2F2F2"/>
           </w:tcPr>
           <w:p>
             <w:pPr>
@@ -1231,13 +1306,38 @@
         <w:jc w:val="center"/>
       </w:pPr>
       <w:r>
-        <w:rPr>
-          <w:rFonts w:ascii="Arial" w:hAnsi="Arial"/>
-          <w:b/>
-          <w:color w:val="EF4444"/>
-          <w:sz w:val="22"/>
-        </w:rPr>
-        <w:t>[ TEMPEL SCREENSHOT: TEMPEL SCREENSHOT TERMINAL SETELAH BERHASIL MEMBUAT FILE MIGRATION BARU DI SINI ]</w:t>
+        <w:drawing>
+          <wp:inline xmlns:a="http://schemas.openxmlformats.org/drawingml/2006/main" xmlns:pic="http://schemas.openxmlformats.org/drawingml/2006/picture">
+            <wp:extent cx="4754880" cy="2530673"/>
+            <wp:docPr id="9" name="Picture 9"/>
+            <wp:cNvGraphicFramePr>
+              <a:graphicFrameLocks noChangeAspect="1"/>
+            </wp:cNvGraphicFramePr>
+            <a:graphic>
+              <a:graphicData uri="http://schemas.openxmlformats.org/drawingml/2006/picture">
+                <pic:pic>
+                  <pic:nvPicPr>
+                    <pic:cNvPr id="0" name="media__1783244573476.png"/>
+                    <pic:cNvPicPr/>
+                  </pic:nvPicPr>
+                  <pic:blipFill>
+                    <a:blip r:embed="rId17"/>
+                    <a:stretch>
+                      <a:fillRect/>
+                    </a:stretch>
+                  </pic:blipFill>
+                  <pic:spPr>
+                    <a:xfrm>
+                      <a:off x="0" y="0"/>
+                      <a:ext cx="4754880" cy="2530673"/>
+                    </a:xfrm>
+                    <a:prstGeom prst="rect"/>
+                  </pic:spPr>
+                </pic:pic>
+              </a:graphicData>
+            </a:graphic>
+          </wp:inline>
+        </w:drawing>
       </w:r>
     </w:p>
     <w:p>
@@ -1249,10 +1349,10 @@
         <w:rPr>
           <w:rFonts w:ascii="Arial" w:hAnsi="Arial"/>
           <w:i/>
-          <w:color w:val="94A3B8"/>
+          <w:color w:val="64748B"/>
           <w:sz w:val="18"/>
         </w:rPr>
-        <w:t>(Silakan ambil screenshot dari kodingan atau browser lokal, lalu tempel di atas)</w:t>
+        <w:t>(Screenshot Output Program untuk Membuat File Migration Baru)</w:t>
       </w:r>
     </w:p>
     <w:p>
@@ -1303,7 +1403,7 @@
         <w:tc>
           <w:tcPr>
             <w:tcW w:type="dxa" w:w="8640"/>
-            <w:shd w:val="clear" w:color="auto" w:fill="F2F2F2"/>
+            <w:shd w:fill="F2F2F2"/>
           </w:tcPr>
           <w:p>
             <w:pPr>
@@ -1438,7 +1538,7 @@
         <w:tc>
           <w:tcPr>
             <w:tcW w:type="dxa" w:w="8640"/>
-            <w:shd w:val="clear" w:color="auto" w:fill="F2F2F2"/>
+            <w:shd w:fill="F2F2F2"/>
           </w:tcPr>
           <w:p>
             <w:pPr>
@@ -1555,7 +1655,7 @@
         <w:tc>
           <w:tcPr>
             <w:tcW w:type="dxa" w:w="8640"/>
-            <w:shd w:val="clear" w:color="auto" w:fill="F2F2F2"/>
+            <w:shd w:fill="F2F2F2"/>
           </w:tcPr>
           <w:p>
             <w:pPr>
@@ -1672,7 +1772,7 @@
         <w:tc>
           <w:tcPr>
             <w:tcW w:type="dxa" w:w="8640"/>
-            <w:shd w:val="clear" w:color="auto" w:fill="F2F2F2"/>
+            <w:shd w:fill="F2F2F2"/>
           </w:tcPr>
           <w:p>
             <w:pPr>
@@ -1814,7 +1914,7 @@
         <w:tc>
           <w:tcPr>
             <w:tcW w:type="dxa" w:w="8640"/>
-            <w:shd w:val="clear" w:color="auto" w:fill="F2F2F2"/>
+            <w:shd w:fill="F2F2F2"/>
           </w:tcPr>
           <w:p>
             <w:pPr>
@@ -1931,7 +2031,7 @@
         <w:tc>
           <w:tcPr>
             <w:tcW w:type="dxa" w:w="8640"/>
-            <w:shd w:val="clear" w:color="auto" w:fill="F2F2F2"/>
+            <w:shd w:fill="F2F2F2"/>
           </w:tcPr>
           <w:p>
             <w:pPr>
@@ -2073,7 +2173,7 @@
         <w:tc>
           <w:tcPr>
             <w:tcW w:type="dxa" w:w="8640"/>
-            <w:shd w:val="clear" w:color="auto" w:fill="F2F2F2"/>
+            <w:shd w:fill="F2F2F2"/>
           </w:tcPr>
           <w:p>
             <w:pPr>
@@ -2193,7 +2293,7 @@
         <w:tc>
           <w:tcPr>
             <w:tcW w:type="dxa" w:w="8640"/>
-            <w:shd w:val="clear" w:color="auto" w:fill="F2F2F2"/>
+            <w:shd w:fill="F2F2F2"/>
           </w:tcPr>
           <w:p>
             <w:pPr>
@@ -2334,7 +2434,7 @@
         <w:tc>
           <w:tcPr>
             <w:tcW w:type="dxa" w:w="8640"/>
-            <w:shd w:val="clear" w:color="auto" w:fill="F2F2F2"/>
+            <w:shd w:fill="F2F2F2"/>
           </w:tcPr>
           <w:p>
             <w:pPr>
@@ -2394,7 +2494,7 @@
         <w:drawing>
           <wp:inline xmlns:a="http://schemas.openxmlformats.org/drawingml/2006/main" xmlns:pic="http://schemas.openxmlformats.org/drawingml/2006/picture">
             <wp:extent cx="4754880" cy="2512100"/>
-            <wp:docPr id="6" name="Picture 6"/>
+            <wp:docPr id="10" name="Picture 10"/>
             <wp:cNvGraphicFramePr>
               <a:graphicFrameLocks noChangeAspect="1"/>
             </wp:cNvGraphicFramePr>
@@ -2406,7 +2506,7 @@
                     <pic:cNvPicPr/>
                   </pic:nvPicPr>
                   <pic:blipFill>
-                    <a:blip r:embed="rId14"/>
+                    <a:blip r:embed="rId18"/>
                     <a:stretch>
                       <a:fillRect/>
                     </a:stretch>

</xml_diff>

<commit_message>
Embed php artisan migrate status screenshot into Task 2 Word report document
</commit_message>
<xml_diff>
--- a/Portfolio WP2/2_Unjuk_Kerja Menulis Kode Dengan Prinsip Sesuai Guidelines dan Best Practice - Nugraha Jody.docx
+++ b/Portfolio WP2/2_Unjuk_Kerja Menulis Kode Dengan Prinsip Sesuai Guidelines dan Best Practice - Nugraha Jody.docx
@@ -113,7 +113,7 @@
         <w:tc>
           <w:tcPr>
             <w:tcW w:type="dxa" w:w="8640"/>
-            <w:shd w:fill="F2F2F2"/>
+            <w:shd w:val="clear" w:color="auto" w:fill="F2F2F2"/>
           </w:tcPr>
           <w:p>
             <w:pPr>
@@ -255,7 +255,7 @@
         <w:tc>
           <w:tcPr>
             <w:tcW w:type="dxa" w:w="8640"/>
-            <w:shd w:fill="F2F2F2"/>
+            <w:shd w:val="clear" w:color="auto" w:fill="F2F2F2"/>
           </w:tcPr>
           <w:p>
             <w:pPr>
@@ -397,7 +397,7 @@
         <w:tc>
           <w:tcPr>
             <w:tcW w:type="dxa" w:w="8640"/>
-            <w:shd w:fill="F2F2F2"/>
+            <w:shd w:val="clear" w:color="auto" w:fill="F2F2F2"/>
           </w:tcPr>
           <w:p>
             <w:pPr>
@@ -539,7 +539,7 @@
         <w:tc>
           <w:tcPr>
             <w:tcW w:type="dxa" w:w="8640"/>
-            <w:shd w:fill="F2F2F2"/>
+            <w:shd w:val="clear" w:color="auto" w:fill="F2F2F2"/>
           </w:tcPr>
           <w:p>
             <w:pPr>
@@ -681,7 +681,7 @@
         <w:tc>
           <w:tcPr>
             <w:tcW w:type="dxa" w:w="8640"/>
-            <w:shd w:fill="F2F2F2"/>
+            <w:shd w:val="clear" w:color="auto" w:fill="F2F2F2"/>
           </w:tcPr>
           <w:p>
             <w:pPr>
@@ -825,7 +825,7 @@
         <w:tc>
           <w:tcPr>
             <w:tcW w:type="dxa" w:w="8640"/>
-            <w:shd w:fill="F2F2F2"/>
+            <w:shd w:val="clear" w:color="auto" w:fill="F2F2F2"/>
           </w:tcPr>
           <w:p>
             <w:pPr>
@@ -967,7 +967,7 @@
         <w:tc>
           <w:tcPr>
             <w:tcW w:type="dxa" w:w="8640"/>
-            <w:shd w:fill="F2F2F2"/>
+            <w:shd w:val="clear" w:color="auto" w:fill="F2F2F2"/>
           </w:tcPr>
           <w:p>
             <w:pPr>
@@ -1109,7 +1109,7 @@
         <w:tc>
           <w:tcPr>
             <w:tcW w:type="dxa" w:w="8640"/>
-            <w:shd w:fill="F2F2F2"/>
+            <w:shd w:val="clear" w:color="auto" w:fill="F2F2F2"/>
           </w:tcPr>
           <w:p>
             <w:pPr>
@@ -1261,7 +1261,7 @@
         <w:tc>
           <w:tcPr>
             <w:tcW w:type="dxa" w:w="8640"/>
-            <w:shd w:fill="F2F2F2"/>
+            <w:shd w:val="clear" w:color="auto" w:fill="F2F2F2"/>
           </w:tcPr>
           <w:p>
             <w:pPr>
@@ -1403,7 +1403,7 @@
         <w:tc>
           <w:tcPr>
             <w:tcW w:type="dxa" w:w="8640"/>
-            <w:shd w:fill="F2F2F2"/>
+            <w:shd w:val="clear" w:color="auto" w:fill="F2F2F2"/>
           </w:tcPr>
           <w:p>
             <w:pPr>
@@ -1538,7 +1538,7 @@
         <w:tc>
           <w:tcPr>
             <w:tcW w:type="dxa" w:w="8640"/>
-            <w:shd w:fill="F2F2F2"/>
+            <w:shd w:val="clear" w:color="auto" w:fill="F2F2F2"/>
           </w:tcPr>
           <w:p>
             <w:pPr>
@@ -1574,7 +1574,7 @@
           <w:rFonts w:ascii="Arial" w:hAnsi="Arial"/>
           <w:sz w:val="20"/>
         </w:rPr>
-        <w:t>Artisan akan mengeksekusi method up() pada seluruh file migration yang belum berjalan dan membuat tabel secara fisik di database MySQL.</w:t>
+        <w:t>Artisan mengeksekusi skema tabel migrasi ke database. Di sini ditunjukkan status seluruh tabel migrasi (termasuk bookings) yang telah berhasil dieksekusi (Ran).</w:t>
       </w:r>
     </w:p>
     <w:p>
@@ -1583,13 +1583,38 @@
         <w:jc w:val="center"/>
       </w:pPr>
       <w:r>
-        <w:rPr>
-          <w:rFonts w:ascii="Arial" w:hAnsi="Arial"/>
-          <w:b/>
-          <w:color w:val="EF4444"/>
-          <w:sz w:val="22"/>
-        </w:rPr>
-        <w:t>[ TEMPEL SCREENSHOT: TEMPEL SCREENSHOT TERMINAL SAAT PROSES PHP ARTISAN MIGRATE SELESAI DIJALANKAN DI SINI ]</w:t>
+        <w:drawing>
+          <wp:inline xmlns:a="http://schemas.openxmlformats.org/drawingml/2006/main" xmlns:pic="http://schemas.openxmlformats.org/drawingml/2006/picture">
+            <wp:extent cx="4754880" cy="2572464"/>
+            <wp:docPr id="10" name="Picture 10"/>
+            <wp:cNvGraphicFramePr>
+              <a:graphicFrameLocks noChangeAspect="1"/>
+            </wp:cNvGraphicFramePr>
+            <a:graphic>
+              <a:graphicData uri="http://schemas.openxmlformats.org/drawingml/2006/picture">
+                <pic:pic>
+                  <pic:nvPicPr>
+                    <pic:cNvPr id="0" name="media__1783244845595.png"/>
+                    <pic:cNvPicPr/>
+                  </pic:nvPicPr>
+                  <pic:blipFill>
+                    <a:blip r:embed="rId18"/>
+                    <a:stretch>
+                      <a:fillRect/>
+                    </a:stretch>
+                  </pic:blipFill>
+                  <pic:spPr>
+                    <a:xfrm>
+                      <a:off x="0" y="0"/>
+                      <a:ext cx="4754880" cy="2572464"/>
+                    </a:xfrm>
+                    <a:prstGeom prst="rect"/>
+                  </pic:spPr>
+                </pic:pic>
+              </a:graphicData>
+            </a:graphic>
+          </wp:inline>
+        </w:drawing>
       </w:r>
     </w:p>
     <w:p>
@@ -1601,10 +1626,10 @@
         <w:rPr>
           <w:rFonts w:ascii="Arial" w:hAnsi="Arial"/>
           <w:i/>
-          <w:color w:val="94A3B8"/>
+          <w:color w:val="64748B"/>
           <w:sz w:val="18"/>
         </w:rPr>
-        <w:t>(Silakan ambil screenshot dari kodingan atau browser lokal, lalu tempel di atas)</w:t>
+        <w:t>(Screenshot Output Program untuk Eksekusi Migration ke Database)</w:t>
       </w:r>
     </w:p>
     <w:p>
@@ -1655,7 +1680,7 @@
         <w:tc>
           <w:tcPr>
             <w:tcW w:type="dxa" w:w="8640"/>
-            <w:shd w:fill="F2F2F2"/>
+            <w:shd w:val="clear" w:color="auto" w:fill="F2F2F2"/>
           </w:tcPr>
           <w:p>
             <w:pPr>
@@ -1772,7 +1797,7 @@
         <w:tc>
           <w:tcPr>
             <w:tcW w:type="dxa" w:w="8640"/>
-            <w:shd w:fill="F2F2F2"/>
+            <w:shd w:val="clear" w:color="auto" w:fill="F2F2F2"/>
           </w:tcPr>
           <w:p>
             <w:pPr>
@@ -1914,7 +1939,7 @@
         <w:tc>
           <w:tcPr>
             <w:tcW w:type="dxa" w:w="8640"/>
-            <w:shd w:fill="F2F2F2"/>
+            <w:shd w:val="clear" w:color="auto" w:fill="F2F2F2"/>
           </w:tcPr>
           <w:p>
             <w:pPr>
@@ -2031,7 +2056,7 @@
         <w:tc>
           <w:tcPr>
             <w:tcW w:type="dxa" w:w="8640"/>
-            <w:shd w:fill="F2F2F2"/>
+            <w:shd w:val="clear" w:color="auto" w:fill="F2F2F2"/>
           </w:tcPr>
           <w:p>
             <w:pPr>
@@ -2173,7 +2198,7 @@
         <w:tc>
           <w:tcPr>
             <w:tcW w:type="dxa" w:w="8640"/>
-            <w:shd w:fill="F2F2F2"/>
+            <w:shd w:val="clear" w:color="auto" w:fill="F2F2F2"/>
           </w:tcPr>
           <w:p>
             <w:pPr>
@@ -2293,7 +2318,7 @@
         <w:tc>
           <w:tcPr>
             <w:tcW w:type="dxa" w:w="8640"/>
-            <w:shd w:fill="F2F2F2"/>
+            <w:shd w:val="clear" w:color="auto" w:fill="F2F2F2"/>
           </w:tcPr>
           <w:p>
             <w:pPr>
@@ -2434,7 +2459,7 @@
         <w:tc>
           <w:tcPr>
             <w:tcW w:type="dxa" w:w="8640"/>
-            <w:shd w:fill="F2F2F2"/>
+            <w:shd w:val="clear" w:color="auto" w:fill="F2F2F2"/>
           </w:tcPr>
           <w:p>
             <w:pPr>
@@ -2494,7 +2519,7 @@
         <w:drawing>
           <wp:inline xmlns:a="http://schemas.openxmlformats.org/drawingml/2006/main" xmlns:pic="http://schemas.openxmlformats.org/drawingml/2006/picture">
             <wp:extent cx="4754880" cy="2512100"/>
-            <wp:docPr id="10" name="Picture 10"/>
+            <wp:docPr id="11" name="Picture 11"/>
             <wp:cNvGraphicFramePr>
               <a:graphicFrameLocks noChangeAspect="1"/>
             </wp:cNvGraphicFramePr>
@@ -2506,7 +2531,7 @@
                     <pic:cNvPicPr/>
                   </pic:nvPicPr>
                   <pic:blipFill>
-                    <a:blip r:embed="rId18"/>
+                    <a:blip r:embed="rId19"/>
                     <a:stretch>
                       <a:fillRect/>
                     </a:stretch>

</xml_diff>

<commit_message>
Embed model and controller creation screenshots into Task 2 Word report document
</commit_message>
<xml_diff>
--- a/Portfolio WP2/2_Unjuk_Kerja Menulis Kode Dengan Prinsip Sesuai Guidelines dan Best Practice - Nugraha Jody.docx
+++ b/Portfolio WP2/2_Unjuk_Kerja Menulis Kode Dengan Prinsip Sesuai Guidelines dan Best Practice - Nugraha Jody.docx
@@ -1725,13 +1725,38 @@
         <w:jc w:val="center"/>
       </w:pPr>
       <w:r>
-        <w:rPr>
-          <w:rFonts w:ascii="Arial" w:hAnsi="Arial"/>
-          <w:b/>
-          <w:color w:val="EF4444"/>
-          <w:sz w:val="22"/>
-        </w:rPr>
-        <w:t>[ TEMPEL SCREENSHOT: TEMPEL SCREENSHOT TERMINAL SETELAH SUKSES MEMBUAT MODEL BOOKING DI SINI ]</w:t>
+        <w:drawing>
+          <wp:inline xmlns:a="http://schemas.openxmlformats.org/drawingml/2006/main" xmlns:pic="http://schemas.openxmlformats.org/drawingml/2006/picture">
+            <wp:extent cx="4754880" cy="2521387"/>
+            <wp:docPr id="11" name="Picture 11"/>
+            <wp:cNvGraphicFramePr>
+              <a:graphicFrameLocks noChangeAspect="1"/>
+            </wp:cNvGraphicFramePr>
+            <a:graphic>
+              <a:graphicData uri="http://schemas.openxmlformats.org/drawingml/2006/picture">
+                <pic:pic>
+                  <pic:nvPicPr>
+                    <pic:cNvPr id="0" name="media__1783245097309.png"/>
+                    <pic:cNvPicPr/>
+                  </pic:nvPicPr>
+                  <pic:blipFill>
+                    <a:blip r:embed="rId19"/>
+                    <a:stretch>
+                      <a:fillRect/>
+                    </a:stretch>
+                  </pic:blipFill>
+                  <pic:spPr>
+                    <a:xfrm>
+                      <a:off x="0" y="0"/>
+                      <a:ext cx="4754880" cy="2521387"/>
+                    </a:xfrm>
+                    <a:prstGeom prst="rect"/>
+                  </pic:spPr>
+                </pic:pic>
+              </a:graphicData>
+            </a:graphic>
+          </wp:inline>
+        </w:drawing>
       </w:r>
     </w:p>
     <w:p>
@@ -1743,10 +1768,10 @@
         <w:rPr>
           <w:rFonts w:ascii="Arial" w:hAnsi="Arial"/>
           <w:i/>
-          <w:color w:val="94A3B8"/>
+          <w:color w:val="64748B"/>
           <w:sz w:val="18"/>
         </w:rPr>
-        <w:t>(Silakan ambil screenshot dari kodingan atau browser lokal, lalu tempel di atas)</w:t>
+        <w:t>(Screenshot Output Program untuk Membuat Model Booking)</w:t>
       </w:r>
     </w:p>
     <w:p>
@@ -1984,13 +2009,38 @@
         <w:jc w:val="center"/>
       </w:pPr>
       <w:r>
-        <w:rPr>
-          <w:rFonts w:ascii="Arial" w:hAnsi="Arial"/>
-          <w:b/>
-          <w:color w:val="EF4444"/>
-          <w:sz w:val="22"/>
-        </w:rPr>
-        <w:t>[ TEMPEL SCREENSHOT: TEMPEL SCREENSHOT TERMINAL SETELAH BERHASIL MEMBUAT WORKSHOPCONTROLLER DI SINI ]</w:t>
+        <w:drawing>
+          <wp:inline xmlns:a="http://schemas.openxmlformats.org/drawingml/2006/main" xmlns:pic="http://schemas.openxmlformats.org/drawingml/2006/picture">
+            <wp:extent cx="4754880" cy="2539960"/>
+            <wp:docPr id="12" name="Picture 12"/>
+            <wp:cNvGraphicFramePr>
+              <a:graphicFrameLocks noChangeAspect="1"/>
+            </wp:cNvGraphicFramePr>
+            <a:graphic>
+              <a:graphicData uri="http://schemas.openxmlformats.org/drawingml/2006/picture">
+                <pic:pic>
+                  <pic:nvPicPr>
+                    <pic:cNvPr id="0" name="media__1783245153786.png"/>
+                    <pic:cNvPicPr/>
+                  </pic:nvPicPr>
+                  <pic:blipFill>
+                    <a:blip r:embed="rId20"/>
+                    <a:stretch>
+                      <a:fillRect/>
+                    </a:stretch>
+                  </pic:blipFill>
+                  <pic:spPr>
+                    <a:xfrm>
+                      <a:off x="0" y="0"/>
+                      <a:ext cx="4754880" cy="2539960"/>
+                    </a:xfrm>
+                    <a:prstGeom prst="rect"/>
+                  </pic:spPr>
+                </pic:pic>
+              </a:graphicData>
+            </a:graphic>
+          </wp:inline>
+        </w:drawing>
       </w:r>
     </w:p>
     <w:p>
@@ -2002,10 +2052,10 @@
         <w:rPr>
           <w:rFonts w:ascii="Arial" w:hAnsi="Arial"/>
           <w:i/>
-          <w:color w:val="94A3B8"/>
+          <w:color w:val="64748B"/>
           <w:sz w:val="18"/>
         </w:rPr>
-        <w:t>(Silakan ambil screenshot dari kodingan atau browser lokal, lalu tempel di atas)</w:t>
+        <w:t>(Screenshot Output Program untuk Membuat Resource Controller)</w:t>
       </w:r>
     </w:p>
     <w:p>
@@ -2519,7 +2569,7 @@
         <w:drawing>
           <wp:inline xmlns:a="http://schemas.openxmlformats.org/drawingml/2006/main" xmlns:pic="http://schemas.openxmlformats.org/drawingml/2006/picture">
             <wp:extent cx="4754880" cy="2512100"/>
-            <wp:docPr id="11" name="Picture 11"/>
+            <wp:docPr id="13" name="Picture 13"/>
             <wp:cNvGraphicFramePr>
               <a:graphicFrameLocks noChangeAspect="1"/>
             </wp:cNvGraphicFramePr>
@@ -2531,7 +2581,7 @@
                     <pic:cNvPicPr/>
                   </pic:nvPicPr>
                   <pic:blipFill>
-                    <a:blip r:embed="rId19"/>
+                    <a:blip r:embed="rId21"/>
                     <a:stretch>
                       <a:fillRect/>
                     </a:stretch>

</xml_diff>

<commit_message>
Embed migration, model, and controller code screenshots into Task 2 Word report document
</commit_message>
<xml_diff>
--- a/Portfolio WP2/2_Unjuk_Kerja Menulis Kode Dengan Prinsip Sesuai Guidelines dan Best Practice - Nugraha Jody.docx
+++ b/Portfolio WP2/2_Unjuk_Kerja Menulis Kode Dengan Prinsip Sesuai Guidelines dan Best Practice - Nugraha Jody.docx
@@ -1466,13 +1466,38 @@
         <w:jc w:val="center"/>
       </w:pPr>
       <w:r>
-        <w:rPr>
-          <w:rFonts w:ascii="Arial" w:hAnsi="Arial"/>
-          <w:b/>
-          <w:color w:val="EF4444"/>
-          <w:sz w:val="22"/>
-        </w:rPr>
-        <w:t>[ TEMPEL SCREENSHOT: TEMPEL SCREENSHOT KODE EDITOR VS CODE SAAT MENGEDIT FILE MIGRATION BOOKINGS DI SINI ]</w:t>
+        <w:drawing>
+          <wp:inline xmlns:a="http://schemas.openxmlformats.org/drawingml/2006/main" xmlns:pic="http://schemas.openxmlformats.org/drawingml/2006/picture">
+            <wp:extent cx="4754880" cy="2549247"/>
+            <wp:docPr id="10" name="Picture 10"/>
+            <wp:cNvGraphicFramePr>
+              <a:graphicFrameLocks noChangeAspect="1"/>
+            </wp:cNvGraphicFramePr>
+            <a:graphic>
+              <a:graphicData uri="http://schemas.openxmlformats.org/drawingml/2006/picture">
+                <pic:pic>
+                  <pic:nvPicPr>
+                    <pic:cNvPr id="0" name="media__1783245378448.png"/>
+                    <pic:cNvPicPr/>
+                  </pic:nvPicPr>
+                  <pic:blipFill>
+                    <a:blip r:embed="rId18"/>
+                    <a:stretch>
+                      <a:fillRect/>
+                    </a:stretch>
+                  </pic:blipFill>
+                  <pic:spPr>
+                    <a:xfrm>
+                      <a:off x="0" y="0"/>
+                      <a:ext cx="4754880" cy="2549247"/>
+                    </a:xfrm>
+                    <a:prstGeom prst="rect"/>
+                  </pic:spPr>
+                </pic:pic>
+              </a:graphicData>
+            </a:graphic>
+          </wp:inline>
+        </w:drawing>
       </w:r>
     </w:p>
     <w:p>
@@ -1484,10 +1509,10 @@
         <w:rPr>
           <w:rFonts w:ascii="Arial" w:hAnsi="Arial"/>
           <w:i/>
-          <w:color w:val="94A3B8"/>
+          <w:color w:val="64748B"/>
           <w:sz w:val="18"/>
         </w:rPr>
-        <w:t>(Silakan ambil screenshot dari kodingan atau browser lokal, lalu tempel di atas)</w:t>
+        <w:t>(Screenshot Output Program untuk Menyusun Skema/Blueprint Migration)</w:t>
       </w:r>
     </w:p>
     <w:p>
@@ -1586,7 +1611,7 @@
         <w:drawing>
           <wp:inline xmlns:a="http://schemas.openxmlformats.org/drawingml/2006/main" xmlns:pic="http://schemas.openxmlformats.org/drawingml/2006/picture">
             <wp:extent cx="4754880" cy="2572464"/>
-            <wp:docPr id="10" name="Picture 10"/>
+            <wp:docPr id="11" name="Picture 11"/>
             <wp:cNvGraphicFramePr>
               <a:graphicFrameLocks noChangeAspect="1"/>
             </wp:cNvGraphicFramePr>
@@ -1598,7 +1623,7 @@
                     <pic:cNvPicPr/>
                   </pic:nvPicPr>
                   <pic:blipFill>
-                    <a:blip r:embed="rId18"/>
+                    <a:blip r:embed="rId19"/>
                     <a:stretch>
                       <a:fillRect/>
                     </a:stretch>
@@ -1728,7 +1753,7 @@
         <w:drawing>
           <wp:inline xmlns:a="http://schemas.openxmlformats.org/drawingml/2006/main" xmlns:pic="http://schemas.openxmlformats.org/drawingml/2006/picture">
             <wp:extent cx="4754880" cy="2521387"/>
-            <wp:docPr id="11" name="Picture 11"/>
+            <wp:docPr id="12" name="Picture 12"/>
             <wp:cNvGraphicFramePr>
               <a:graphicFrameLocks noChangeAspect="1"/>
             </wp:cNvGraphicFramePr>
@@ -1740,7 +1765,7 @@
                     <pic:cNvPicPr/>
                   </pic:nvPicPr>
                   <pic:blipFill>
-                    <a:blip r:embed="rId19"/>
+                    <a:blip r:embed="rId20"/>
                     <a:stretch>
                       <a:fillRect/>
                     </a:stretch>
@@ -1892,13 +1917,38 @@
         <w:jc w:val="center"/>
       </w:pPr>
       <w:r>
-        <w:rPr>
-          <w:rFonts w:ascii="Arial" w:hAnsi="Arial"/>
-          <w:b/>
-          <w:color w:val="EF4444"/>
-          <w:sz w:val="22"/>
-        </w:rPr>
-        <w:t>[ TEMPEL SCREENSHOT: TEMPEL SCREENSHOT KODE FILE BOOKING.PHP DI EDITOR VS CODE DI SINI ]</w:t>
+        <w:drawing>
+          <wp:inline xmlns:a="http://schemas.openxmlformats.org/drawingml/2006/main" xmlns:pic="http://schemas.openxmlformats.org/drawingml/2006/picture">
+            <wp:extent cx="4754880" cy="2544604"/>
+            <wp:docPr id="13" name="Picture 13"/>
+            <wp:cNvGraphicFramePr>
+              <a:graphicFrameLocks noChangeAspect="1"/>
+            </wp:cNvGraphicFramePr>
+            <a:graphic>
+              <a:graphicData uri="http://schemas.openxmlformats.org/drawingml/2006/picture">
+                <pic:pic>
+                  <pic:nvPicPr>
+                    <pic:cNvPr id="0" name="media__1783245556383.png"/>
+                    <pic:cNvPicPr/>
+                  </pic:nvPicPr>
+                  <pic:blipFill>
+                    <a:blip r:embed="rId21"/>
+                    <a:stretch>
+                      <a:fillRect/>
+                    </a:stretch>
+                  </pic:blipFill>
+                  <pic:spPr>
+                    <a:xfrm>
+                      <a:off x="0" y="0"/>
+                      <a:ext cx="4754880" cy="2544604"/>
+                    </a:xfrm>
+                    <a:prstGeom prst="rect"/>
+                  </pic:spPr>
+                </pic:pic>
+              </a:graphicData>
+            </a:graphic>
+          </wp:inline>
+        </w:drawing>
       </w:r>
     </w:p>
     <w:p>
@@ -1910,10 +1960,10 @@
         <w:rPr>
           <w:rFonts w:ascii="Arial" w:hAnsi="Arial"/>
           <w:i/>
-          <w:color w:val="94A3B8"/>
+          <w:color w:val="64748B"/>
           <w:sz w:val="18"/>
         </w:rPr>
-        <w:t>(Silakan ambil screenshot dari kodingan atau browser lokal, lalu tempel di atas)</w:t>
+        <w:t>(Screenshot Output Program untuk Mengisi Kode Model &amp; Relasi)</w:t>
       </w:r>
     </w:p>
     <w:p>
@@ -2012,7 +2062,7 @@
         <w:drawing>
           <wp:inline xmlns:a="http://schemas.openxmlformats.org/drawingml/2006/main" xmlns:pic="http://schemas.openxmlformats.org/drawingml/2006/picture">
             <wp:extent cx="4754880" cy="2539960"/>
-            <wp:docPr id="12" name="Picture 12"/>
+            <wp:docPr id="14" name="Picture 14"/>
             <wp:cNvGraphicFramePr>
               <a:graphicFrameLocks noChangeAspect="1"/>
             </wp:cNvGraphicFramePr>
@@ -2024,7 +2074,7 @@
                     <pic:cNvPicPr/>
                   </pic:nvPicPr>
                   <pic:blipFill>
-                    <a:blip r:embed="rId20"/>
+                    <a:blip r:embed="rId22"/>
                     <a:stretch>
                       <a:fillRect/>
                     </a:stretch>
@@ -2176,13 +2226,38 @@
         <w:jc w:val="center"/>
       </w:pPr>
       <w:r>
-        <w:rPr>
-          <w:rFonts w:ascii="Arial" w:hAnsi="Arial"/>
-          <w:b/>
-          <w:color w:val="EF4444"/>
-          <w:sz w:val="22"/>
-        </w:rPr>
-        <w:t>[ TEMPEL SCREENSHOT: TEMPEL SCREENSHOT FILE WORKSHOPCONTROLLER.PHP DI EDITOR VS CODE DI SINI ]</w:t>
+        <w:drawing>
+          <wp:inline xmlns:a="http://schemas.openxmlformats.org/drawingml/2006/main" xmlns:pic="http://schemas.openxmlformats.org/drawingml/2006/picture">
+            <wp:extent cx="4754880" cy="2539960"/>
+            <wp:docPr id="15" name="Picture 15"/>
+            <wp:cNvGraphicFramePr>
+              <a:graphicFrameLocks noChangeAspect="1"/>
+            </wp:cNvGraphicFramePr>
+            <a:graphic>
+              <a:graphicData uri="http://schemas.openxmlformats.org/drawingml/2006/picture">
+                <pic:pic>
+                  <pic:nvPicPr>
+                    <pic:cNvPr id="0" name="media__1783245610722.png"/>
+                    <pic:cNvPicPr/>
+                  </pic:nvPicPr>
+                  <pic:blipFill>
+                    <a:blip r:embed="rId23"/>
+                    <a:stretch>
+                      <a:fillRect/>
+                    </a:stretch>
+                  </pic:blipFill>
+                  <pic:spPr>
+                    <a:xfrm>
+                      <a:off x="0" y="0"/>
+                      <a:ext cx="4754880" cy="2539960"/>
+                    </a:xfrm>
+                    <a:prstGeom prst="rect"/>
+                  </pic:spPr>
+                </pic:pic>
+              </a:graphicData>
+            </a:graphic>
+          </wp:inline>
+        </w:drawing>
       </w:r>
     </w:p>
     <w:p>
@@ -2194,10 +2269,10 @@
         <w:rPr>
           <w:rFonts w:ascii="Arial" w:hAnsi="Arial"/>
           <w:i/>
-          <w:color w:val="94A3B8"/>
+          <w:color w:val="64748B"/>
           <w:sz w:val="18"/>
         </w:rPr>
-        <w:t>(Silakan ambil screenshot dari kodingan atau browser lokal, lalu tempel di atas)</w:t>
+        <w:t>(Screenshot Output Program untuk Implementasi Kode Controller (Index &amp; Store))</w:t>
       </w:r>
     </w:p>
     <w:p>
@@ -2569,7 +2644,7 @@
         <w:drawing>
           <wp:inline xmlns:a="http://schemas.openxmlformats.org/drawingml/2006/main" xmlns:pic="http://schemas.openxmlformats.org/drawingml/2006/picture">
             <wp:extent cx="4754880" cy="2512100"/>
-            <wp:docPr id="13" name="Picture 13"/>
+            <wp:docPr id="16" name="Picture 16"/>
             <wp:cNvGraphicFramePr>
               <a:graphicFrameLocks noChangeAspect="1"/>
             </wp:cNvGraphicFramePr>
@@ -2581,7 +2656,7 @@
                     <pic:cNvPicPr/>
                   </pic:nvPicPr>
                   <pic:blipFill>
-                    <a:blip r:embed="rId21"/>
+                    <a:blip r:embed="rId24"/>
                     <a:stretch>
                       <a:fillRect/>
                     </a:stretch>

</xml_diff>

<commit_message>
Complete Task 2 Word report document with all code and localhost screenshots embedded
</commit_message>
<xml_diff>
--- a/Portfolio WP2/2_Unjuk_Kerja Menulis Kode Dengan Prinsip Sesuai Guidelines dan Best Practice - Nugraha Jody.docx
+++ b/Portfolio WP2/2_Unjuk_Kerja Menulis Kode Dengan Prinsip Sesuai Guidelines dan Best Practice - Nugraha Jody.docx
@@ -2371,13 +2371,38 @@
         <w:jc w:val="center"/>
       </w:pPr>
       <w:r>
-        <w:rPr>
-          <w:rFonts w:ascii="Arial" w:hAnsi="Arial"/>
-          <w:b/>
-          <w:color w:val="EF4444"/>
-          <w:sz w:val="22"/>
-        </w:rPr>
-        <w:t>[ TEMPEL SCREENSHOT: TEMPEL SCREENSHOT FILE ROUTES/WEB.PHP DI VS CODE DI SINI ]</w:t>
+        <w:drawing>
+          <wp:inline xmlns:a="http://schemas.openxmlformats.org/drawingml/2006/main" xmlns:pic="http://schemas.openxmlformats.org/drawingml/2006/picture">
+            <wp:extent cx="4754880" cy="2549247"/>
+            <wp:docPr id="16" name="Picture 16"/>
+            <wp:cNvGraphicFramePr>
+              <a:graphicFrameLocks noChangeAspect="1"/>
+            </wp:cNvGraphicFramePr>
+            <a:graphic>
+              <a:graphicData uri="http://schemas.openxmlformats.org/drawingml/2006/picture">
+                <pic:pic>
+                  <pic:nvPicPr>
+                    <pic:cNvPr id="0" name="media__1783245795699.png"/>
+                    <pic:cNvPicPr/>
+                  </pic:nvPicPr>
+                  <pic:blipFill>
+                    <a:blip r:embed="rId24"/>
+                    <a:stretch>
+                      <a:fillRect/>
+                    </a:stretch>
+                  </pic:blipFill>
+                  <pic:spPr>
+                    <a:xfrm>
+                      <a:off x="0" y="0"/>
+                      <a:ext cx="4754880" cy="2549247"/>
+                    </a:xfrm>
+                    <a:prstGeom prst="rect"/>
+                  </pic:spPr>
+                </pic:pic>
+              </a:graphicData>
+            </a:graphic>
+          </wp:inline>
+        </w:drawing>
       </w:r>
     </w:p>
     <w:p>
@@ -2389,10 +2414,10 @@
         <w:rPr>
           <w:rFonts w:ascii="Arial" w:hAnsi="Arial"/>
           <w:i/>
-          <w:color w:val="94A3B8"/>
+          <w:color w:val="64748B"/>
           <w:sz w:val="18"/>
         </w:rPr>
-        <w:t>(Silakan ambil screenshot dari kodingan atau browser lokal, lalu tempel di atas)</w:t>
+        <w:t>(Screenshot Output Program untuk Mendaftarkan Routing Resource)</w:t>
       </w:r>
     </w:p>
     <w:p>
@@ -2512,13 +2537,38 @@
         <w:jc w:val="center"/>
       </w:pPr>
       <w:r>
-        <w:rPr>
-          <w:rFonts w:ascii="Arial" w:hAnsi="Arial"/>
-          <w:b/>
-          <w:color w:val="EF4444"/>
-          <w:sz w:val="22"/>
-        </w:rPr>
-        <w:t>[ TEMPEL SCREENSHOT: TEMPEL SCREENSHOT FILE DASHBOARD.BLADE.PHP DI VS CODE DI SINI ]</w:t>
+        <w:drawing>
+          <wp:inline xmlns:a="http://schemas.openxmlformats.org/drawingml/2006/main" xmlns:pic="http://schemas.openxmlformats.org/drawingml/2006/picture">
+            <wp:extent cx="4754880" cy="2558534"/>
+            <wp:docPr id="17" name="Picture 17"/>
+            <wp:cNvGraphicFramePr>
+              <a:graphicFrameLocks noChangeAspect="1"/>
+            </wp:cNvGraphicFramePr>
+            <a:graphic>
+              <a:graphicData uri="http://schemas.openxmlformats.org/drawingml/2006/picture">
+                <pic:pic>
+                  <pic:nvPicPr>
+                    <pic:cNvPr id="0" name="media__1783245881901.png"/>
+                    <pic:cNvPicPr/>
+                  </pic:nvPicPr>
+                  <pic:blipFill>
+                    <a:blip r:embed="rId25"/>
+                    <a:stretch>
+                      <a:fillRect/>
+                    </a:stretch>
+                  </pic:blipFill>
+                  <pic:spPr>
+                    <a:xfrm>
+                      <a:off x="0" y="0"/>
+                      <a:ext cx="4754880" cy="2558534"/>
+                    </a:xfrm>
+                    <a:prstGeom prst="rect"/>
+                  </pic:spPr>
+                </pic:pic>
+              </a:graphicData>
+            </a:graphic>
+          </wp:inline>
+        </w:drawing>
       </w:r>
     </w:p>
     <w:p>
@@ -2530,10 +2580,10 @@
         <w:rPr>
           <w:rFonts w:ascii="Arial" w:hAnsi="Arial"/>
           <w:i/>
-          <w:color w:val="94A3B8"/>
+          <w:color w:val="64748B"/>
           <w:sz w:val="18"/>
         </w:rPr>
-        <w:t>(Silakan ambil screenshot dari kodingan atau browser lokal, lalu tempel di atas)</w:t>
+        <w:t>(Screenshot Output Program untuk Membuat View Blade (dashboard.blade.php))</w:t>
       </w:r>
     </w:p>
     <w:p>
@@ -2644,7 +2694,7 @@
         <w:drawing>
           <wp:inline xmlns:a="http://schemas.openxmlformats.org/drawingml/2006/main" xmlns:pic="http://schemas.openxmlformats.org/drawingml/2006/picture">
             <wp:extent cx="4754880" cy="2512100"/>
-            <wp:docPr id="16" name="Picture 16"/>
+            <wp:docPr id="18" name="Picture 18"/>
             <wp:cNvGraphicFramePr>
               <a:graphicFrameLocks noChangeAspect="1"/>
             </wp:cNvGraphicFramePr>
@@ -2656,7 +2706,7 @@
                     <pic:cNvPicPr/>
                   </pic:nvPicPr>
                   <pic:blipFill>
-                    <a:blip r:embed="rId24"/>
+                    <a:blip r:embed="rId26"/>
                     <a:stretch>
                       <a:fillRect/>
                     </a:stretch>

</xml_diff>